<commit_message>
fix(prd): resolve overlap between Table 3 and Figure 2 by stripping floating table properties and ordering in-line layout
</commit_message>
<xml_diff>
--- a/vvdn/smart_programmable_power_supply/PRD.docx
+++ b/vvdn/smart_programmable_power_supply/PRD.docx
@@ -422,7 +422,6 @@
     </w:p>
     <w:tbl>
       <w:tblPr>
-        <w:tblpPr w:leftFromText="180" w:rightFromText="180" w:vertAnchor="text" w:horzAnchor="margin" w:tblpXSpec="center" w:tblpY="353"/>
         <w:tblW w:w="9316" w:type="dxa"/>
         <w:tblLayout w:type="fixed"/>
         <w:tblLook w:val="04A0" w:firstRow="1" w:lastRow="0" w:firstColumn="1" w:lastColumn="0" w:noHBand="0" w:noVBand="1"/>
@@ -6263,6 +6262,103 @@
         <w:t>List of Figures</w:t>
       </w:r>
     </w:p>
+    <w:tbl>
+      <w:tblPr>
+        <w:tblW w:type="dxa" w:w="9316"/>
+        <w:tblLayout w:type="fixed"/>
+        <w:tblLook w:firstColumn="1" w:firstRow="1" w:lastColumn="0" w:lastRow="0" w:noHBand="0" w:noVBand="1" w:val="04A0"/>
+        <w:tblBorders>
+          <w:top w:val="single" w:sz="6" w:space="0" w:color="A0AEC0"/>
+          <w:left w:val="single" w:sz="6" w:space="0" w:color="A0AEC0"/>
+          <w:bottom w:val="single" w:sz="6" w:space="0" w:color="A0AEC0"/>
+          <w:right w:val="single" w:sz="6" w:space="0" w:color="A0AEC0"/>
+          <w:insideH w:val="single" w:sz="6" w:space="0" w:color="A0AEC0"/>
+          <w:insideV w:val="single" w:sz="6" w:space="0" w:color="A0AEC0"/>
+        </w:tblBorders>
+      </w:tblPr>
+      <w:tblGrid>
+        <w:gridCol w:w="9316"/>
+      </w:tblGrid>
+      <w:tr>
+        <w:trPr>
+          <w:cantSplit/>
+          <w:tblHeader/>
+        </w:trPr>
+        <w:tc>
+          <w:tcPr>
+            <w:tcW w:type="dxa" w:w="9316"/>
+            <w:shd w:val="clear" w:color="auto" w:fill="F4F6F9"/>
+            <w:tcMar>
+              <w:top w:w="140" w:type="dxa"/>
+              <w:bottom w:w="140" w:type="dxa"/>
+              <w:left w:w="180" w:type="dxa"/>
+              <w:right w:w="180" w:type="dxa"/>
+            </w:tcMar>
+          </w:tcPr>
+          <w:p>
+            <w:pPr>
+              <w:spacing w:before="40" w:after="40" w:line="252" w:lineRule="auto"/>
+            </w:pPr>
+            <w:r>
+              <w:rPr>
+                <w:rFonts w:ascii="Consolas" w:hAnsi="Consolas"/>
+                <w:color w:val="141923"/>
+                <w:sz w:val="16"/>
+              </w:rPr>
+              <w:t>+--------------------------------------------------------------------------------------------------+</w:t>
+              <w:br/>
+              <w:t>|                                 SPPS MODULE BOUNDARY (SYSTEM 1)                                  |</w:t>
+              <w:br/>
+              <w:t>|                                                                                                  |</w:t>
+              <w:br/>
+              <w:t>|  [AC Mains 85-265V] ---&gt; [2-Stage EMI Filter] ---&gt; [Bridge Rectifier] ---&gt; [Primary DC Bus ~325V] |</w:t>
+              <w:br/>
+              <w:t>|                                                                                |                 |</w:t>
+              <w:br/>
+              <w:t>|                                                                                v                 |</w:t>
+              <w:br/>
+              <w:t>|                                                                 [UCC28740 Quasi-Resonant Flyback] |</w:t>
+              <w:br/>
+              <w:t>|                                                                                |                 |</w:t>
+              <w:br/>
+              <w:t>|                                                                    (Reinforced Galvanic Isolation)|</w:t>
+              <w:br/>
+              <w:t>|                                                                                |                 |</w:t>
+              <w:br/>
+              <w:t>|                                                                                v                 |</w:t>
+              <w:br/>
+              <w:t>|                                                                 [Secondary +24.0V DC Rail (72W)] |</w:t>
+              <w:br/>
+              <w:t>|                                                                                |                 |</w:t>
+              <w:br/>
+              <w:t>|                                                                                v                 |</w:t>
+              <w:br/>
+              <w:t>|                                                                 [LM5176 4-Switch Sync Buck-Boost] |</w:t>
+              <w:br/>
+              <w:t>|                                                                                |                 |</w:t>
+              <w:br/>
+              <w:t>|                                                                                v                 |</w:t>
+              <w:br/>
+              <w:t>|  [DUT / Load] &lt;--- [4mm Gold Binding Posts] &lt;--- [10mΩ Shunt] &lt;--- [Dual LC Filter (sub-25mV)]   |</w:t>
+              <w:br/>
+              <w:t>|                                                      |                         |                 |</w:t>
+              <w:br/>
+              <w:t>|                                                      v                         v                 |</w:t>
+              <w:br/>
+              <w:t>|  [Host PC / ATE] &lt;=== [USB-C SCPI] &lt;=== [STM32G474 MCU Core] &lt;--- [12-Bit DAC Summing Injection]|</w:t>
+              <w:br/>
+              <w:t>|                                                 |                                                |</w:t>
+              <w:br/>
+              <w:t>|                                                 v                                                |</w:t>
+              <w:br/>
+              <w:t>|                                     [1.3" OLED Display &amp; Dual Encoders]                          |</w:t>
+              <w:br/>
+              <w:t>+--------------------------------------------------------------------------------------------------+</w:t>
+            </w:r>
+          </w:p>
+        </w:tc>
+      </w:tr>
+    </w:tbl>
     <w:p>
       <w:pPr>
         <w:pStyle w:val="TableofFigures"/>
@@ -6277,84 +6373,8 @@
         </w:rPr>
       </w:pPr>
       <w:r>
-        <w:rPr>
-          <w:b/>
-          <w:bCs/>
-        </w:rPr>
-        <w:fldChar w:fldCharType="begin"/>
+        <w:t>Figure 1: System Boundary &amp; Interconnect Block Diagram</w:t>
       </w:r>
-      <w:r>
-        <w:rPr>
-          <w:b/>
-          <w:bCs/>
-        </w:rPr>
-        <w:instrText xml:space="preserve"> TOC \h \z \c "Figure" </w:instrText>
-      </w:r>
-      <w:r>
-        <w:rPr>
-          <w:b/>
-          <w:bCs/>
-        </w:rPr>
-        <w:fldChar w:fldCharType="separate"/>
-      </w:r>
-      <w:hyperlink w:anchor="_Toc28279213" w:history="1">
-        <w:r>
-          <w:rPr>
-            <w:rStyle w:val="Hyperlink"/>
-            <w:noProof/>
-            <w:lang w:bidi="hi-IN"/>
-          </w:rPr>
-          <w:t>Figure 1: Boundary Diagram</w:t>
-        </w:r>
-        <w:r>
-          <w:rPr>
-            <w:noProof/>
-            <w:webHidden/>
-          </w:rPr>
-          <w:tab/>
-        </w:r>
-        <w:r>
-          <w:rPr>
-            <w:noProof/>
-            <w:webHidden/>
-          </w:rPr>
-          <w:fldChar w:fldCharType="begin"/>
-        </w:r>
-        <w:r>
-          <w:rPr>
-            <w:noProof/>
-            <w:webHidden/>
-          </w:rPr>
-          <w:instrText xml:space="preserve"> PAGEREF _Toc28279213 \h </w:instrText>
-        </w:r>
-        <w:r>
-          <w:rPr>
-            <w:noProof/>
-            <w:webHidden/>
-          </w:rPr>
-        </w:r>
-        <w:r>
-          <w:rPr>
-            <w:noProof/>
-            <w:webHidden/>
-          </w:rPr>
-          <w:fldChar w:fldCharType="separate"/>
-        </w:r>
-        <w:r>
-          <w:rPr>
-            <w:noProof/>
-            <w:webHidden/>
-          </w:rPr>
-          <w:t>9</w:t>
-        </w:r>
-        <w:r>
-          <w:rPr>
-            <w:noProof/>
-            <w:webHidden/>
-          </w:rPr>
-          <w:fldChar w:fldCharType="end"/>
-        </w:r>
-      </w:hyperlink>
     </w:p>
     <w:p>
       <w:pPr>
@@ -6514,6 +6534,83 @@
         </w:r>
       </w:hyperlink>
     </w:p>
+    <w:tbl>
+      <w:tblPr>
+        <w:tblW w:type="dxa" w:w="9316"/>
+        <w:tblLayout w:type="fixed"/>
+        <w:tblLook w:firstColumn="1" w:firstRow="1" w:lastColumn="0" w:lastRow="0" w:noHBand="0" w:noVBand="1" w:val="04A0"/>
+        <w:tblBorders>
+          <w:top w:val="single" w:sz="6" w:space="0" w:color="A0AEC0"/>
+          <w:left w:val="single" w:sz="6" w:space="0" w:color="A0AEC0"/>
+          <w:bottom w:val="single" w:sz="6" w:space="0" w:color="A0AEC0"/>
+          <w:right w:val="single" w:sz="6" w:space="0" w:color="A0AEC0"/>
+          <w:insideH w:val="single" w:sz="6" w:space="0" w:color="A0AEC0"/>
+          <w:insideV w:val="single" w:sz="6" w:space="0" w:color="A0AEC0"/>
+        </w:tblBorders>
+      </w:tblPr>
+      <w:tblGrid>
+        <w:gridCol w:w="9316"/>
+      </w:tblGrid>
+      <w:tr>
+        <w:trPr>
+          <w:cantSplit/>
+          <w:tblHeader/>
+        </w:trPr>
+        <w:tc>
+          <w:tcPr>
+            <w:tcW w:type="dxa" w:w="9316"/>
+            <w:shd w:val="clear" w:color="auto" w:fill="F4F6F9"/>
+            <w:tcMar>
+              <w:top w:w="140" w:type="dxa"/>
+              <w:bottom w:w="140" w:type="dxa"/>
+              <w:left w:w="180" w:type="dxa"/>
+              <w:right w:w="180" w:type="dxa"/>
+            </w:tcMar>
+          </w:tcPr>
+          <w:p>
+            <w:pPr>
+              <w:spacing w:before="40" w:after="40" w:line="252" w:lineRule="auto"/>
+            </w:pPr>
+            <w:r>
+              <w:rPr>
+                <w:rFonts w:ascii="Consolas" w:hAnsi="Consolas"/>
+                <w:color w:val="141923"/>
+                <w:sz w:val="16"/>
+              </w:rPr>
+              <w:t>+--------------------------------------------------------------------------------------------------+</w:t>
+              <w:br/>
+              <w:t>|                     DUAL-CLOSED-LOOP REAL-TIME CONTROL TOPOLOGY                                  |</w:t>
+              <w:br/>
+              <w:t>+--------------------------------------------------------------------------------------------------+</w:t>
+              <w:br/>
+              <w:t xml:space="preserve">  [OUTER SUPERVISORY DIGITAL LOOP - STM32G474 MCU @ 10 Hz]                                         </w:t>
+              <w:br/>
+              <w:t xml:space="preserve">    • Step 1: Sample Isolated Mains Voltage (AMC1311) &amp; Current (Talema CT) -&gt; Compute True Pac   </w:t>
+              <w:br/>
+              <w:t xml:space="preserve">    • Step 2: Sample Secondary Regulated Rail via I2C (INA226 16-Bit)       -&gt; Compute True Pdc   </w:t>
+              <w:br/>
+              <w:t xml:space="preserve">    • Step 3: Math Engine calculates instantaneous efficiency (η = Pdc / Pac) with digital filter  </w:t>
+              <w:br/>
+              <w:t xml:space="preserve">    • Step 4: Monitor Board Thermal Profile via NTC -&gt; Execute thermal power foldback if T &gt; 85°C  </w:t>
+              <w:br/>
+              <w:t xml:space="preserve">    • Step 5: Service SCPI Commands over USB-CDC &amp; Flush Ring-Buffer CSV records to MicroSD card   </w:t>
+              <w:br/>
+              <w:t xml:space="preserve">                                                                                                   </w:t>
+              <w:br/>
+              <w:t xml:space="preserve">  [INNER ULTRA-FAST ANALOG HARDWARE LOOP - AUTONOMOUS CONTROLLER &amp; COMPARATORS]                    </w:t>
+              <w:br/>
+              <w:t xml:space="preserve">    • Voltage Regulation: LM5176 Type-II Compensation Network restores step transients in &lt; 120µs  </w:t>
+              <w:br/>
+              <w:t xml:space="preserve">    • Hardware CC Limit: Shunt -&gt; INA240A2 (50V/V) -&gt; TLV3501 pulls down COMP pin in &lt; 5.0µs      </w:t>
+              <w:br/>
+              <w:t xml:space="preserve">    • Fast OVP Crowbar: Secondary Comparator clamps COMP to GND in &lt; 2.0µs on output disconnect   </w:t>
+              <w:br/>
+              <w:t>+--------------------------------------------------------------------------------------------------+</w:t>
+            </w:r>
+          </w:p>
+        </w:tc>
+      </w:tr>
+    </w:tbl>
     <w:p>
       <w:pPr>
         <w:pStyle w:val="TableofFigures"/>
@@ -6527,64 +6624,9 @@
           <w:lang w:val="en-IN" w:eastAsia="en-IN"/>
         </w:rPr>
       </w:pPr>
-      <w:hyperlink w:anchor="_Toc28279216" w:history="1">
-        <w:r>
-          <w:rPr>
-            <w:rStyle w:val="Hyperlink"/>
-            <w:noProof/>
-            <w:lang w:bidi="hi-IN"/>
-          </w:rPr>
-          <w:t>Figure 4: Flow Diagram</w:t>
-        </w:r>
-        <w:r>
-          <w:rPr>
-            <w:noProof/>
-            <w:webHidden/>
-          </w:rPr>
-          <w:tab/>
-        </w:r>
-        <w:r>
-          <w:rPr>
-            <w:noProof/>
-            <w:webHidden/>
-          </w:rPr>
-          <w:fldChar w:fldCharType="begin"/>
-        </w:r>
-        <w:r>
-          <w:rPr>
-            <w:noProof/>
-            <w:webHidden/>
-          </w:rPr>
-          <w:instrText xml:space="preserve"> PAGEREF _Toc28279216 \h </w:instrText>
-        </w:r>
-        <w:r>
-          <w:rPr>
-            <w:noProof/>
-            <w:webHidden/>
-          </w:rPr>
-        </w:r>
-        <w:r>
-          <w:rPr>
-            <w:noProof/>
-            <w:webHidden/>
-          </w:rPr>
-          <w:fldChar w:fldCharType="separate"/>
-        </w:r>
-        <w:r>
-          <w:rPr>
-            <w:noProof/>
-            <w:webHidden/>
-          </w:rPr>
-          <w:t>15</w:t>
-        </w:r>
-        <w:r>
-          <w:rPr>
-            <w:noProof/>
-            <w:webHidden/>
-          </w:rPr>
-          <w:fldChar w:fldCharType="end"/>
-        </w:r>
-      </w:hyperlink>
+      <w:r>
+        <w:t>Figure 4: Dual-Closed-Loop Control &amp; Hardware Protection Flow Diagram</w:t>
+      </w:r>
     </w:p>
     <w:p>
       <w:pPr>
@@ -9270,103 +9312,6 @@
       <w:bookmarkStart w:id="36" w:name="_9n6wigtty3he" w:colFirst="0" w:colLast="0"/>
       <w:bookmarkEnd w:id="36"/>
     </w:p>
-    <w:tbl>
-      <w:tblPr>
-        <w:tblW w:type="dxa" w:w="9316"/>
-        <w:tblLayout w:type="fixed"/>
-        <w:tblLook w:firstColumn="1" w:firstRow="1" w:lastColumn="0" w:lastRow="0" w:noHBand="0" w:noVBand="1" w:val="04A0"/>
-        <w:tblBorders>
-          <w:top w:val="single" w:sz="6" w:space="0" w:color="A0AEC0"/>
-          <w:left w:val="single" w:sz="6" w:space="0" w:color="A0AEC0"/>
-          <w:bottom w:val="single" w:sz="6" w:space="0" w:color="A0AEC0"/>
-          <w:right w:val="single" w:sz="6" w:space="0" w:color="A0AEC0"/>
-          <w:insideH w:val="single" w:sz="6" w:space="0" w:color="A0AEC0"/>
-          <w:insideV w:val="single" w:sz="6" w:space="0" w:color="A0AEC0"/>
-        </w:tblBorders>
-      </w:tblPr>
-      <w:tblGrid>
-        <w:gridCol w:w="9316"/>
-      </w:tblGrid>
-      <w:tr>
-        <w:trPr>
-          <w:cantSplit/>
-          <w:tblHeader/>
-        </w:trPr>
-        <w:tc>
-          <w:tcPr>
-            <w:tcW w:type="dxa" w:w="9316"/>
-            <w:shd w:val="clear" w:color="auto" w:fill="F4F6F9"/>
-            <w:tcMar>
-              <w:top w:w="140" w:type="dxa"/>
-              <w:bottom w:w="140" w:type="dxa"/>
-              <w:left w:w="180" w:type="dxa"/>
-              <w:right w:w="180" w:type="dxa"/>
-            </w:tcMar>
-          </w:tcPr>
-          <w:p>
-            <w:pPr>
-              <w:spacing w:before="40" w:after="40" w:line="252" w:lineRule="auto"/>
-            </w:pPr>
-            <w:r>
-              <w:rPr>
-                <w:rFonts w:ascii="Consolas" w:hAnsi="Consolas"/>
-                <w:color w:val="141923"/>
-                <w:sz w:val="16"/>
-              </w:rPr>
-              <w:t>+--------------------------------------------------------------------------------------------------+</w:t>
-              <w:br/>
-              <w:t>|                                 SPPS MODULE BOUNDARY (SYSTEM 1)                                  |</w:t>
-              <w:br/>
-              <w:t>|                                                                                                  |</w:t>
-              <w:br/>
-              <w:t>|  [AC Mains 85-265V] ---&gt; [2-Stage EMI Filter] ---&gt; [Bridge Rectifier] ---&gt; [Primary DC Bus ~325V] |</w:t>
-              <w:br/>
-              <w:t>|                                                                                |                 |</w:t>
-              <w:br/>
-              <w:t>|                                                                                v                 |</w:t>
-              <w:br/>
-              <w:t>|                                                                 [UCC28740 Quasi-Resonant Flyback] |</w:t>
-              <w:br/>
-              <w:t>|                                                                                |                 |</w:t>
-              <w:br/>
-              <w:t>|                                                                    (Reinforced Galvanic Isolation)|</w:t>
-              <w:br/>
-              <w:t>|                                                                                |                 |</w:t>
-              <w:br/>
-              <w:t>|                                                                                v                 |</w:t>
-              <w:br/>
-              <w:t>|                                                                 [Secondary +24.0V DC Rail (72W)] |</w:t>
-              <w:br/>
-              <w:t>|                                                                                |                 |</w:t>
-              <w:br/>
-              <w:t>|                                                                                v                 |</w:t>
-              <w:br/>
-              <w:t>|                                                                 [LM5176 4-Switch Sync Buck-Boost] |</w:t>
-              <w:br/>
-              <w:t>|                                                                                |                 |</w:t>
-              <w:br/>
-              <w:t>|                                                                                v                 |</w:t>
-              <w:br/>
-              <w:t>|  [DUT / Load] &lt;--- [4mm Gold Binding Posts] &lt;--- [10mΩ Shunt] &lt;--- [Dual LC Filter (sub-25mV)]   |</w:t>
-              <w:br/>
-              <w:t>|                                                      |                         |                 |</w:t>
-              <w:br/>
-              <w:t>|                                                      v                         v                 |</w:t>
-              <w:br/>
-              <w:t>|  [Host PC / ATE] &lt;=== [USB-C SCPI] &lt;=== [STM32G474 MCU Core] &lt;--- [12-Bit DAC Summing Injection]|</w:t>
-              <w:br/>
-              <w:t>|                                                 |                                                |</w:t>
-              <w:br/>
-              <w:t>|                                                 v                                                |</w:t>
-              <w:br/>
-              <w:t>|                                     [1.3" OLED Display &amp; Dual Encoders]                          |</w:t>
-              <w:br/>
-              <w:t>+--------------------------------------------------------------------------------------------------+</w:t>
-            </w:r>
-          </w:p>
-        </w:tc>
-      </w:tr>
-    </w:tbl>
     <w:p>
       <w:pPr>
         <w:pStyle w:val="Caption"/>
@@ -9376,20 +9321,31 @@
           <w:sz w:val="22"/>
         </w:rPr>
       </w:pPr>
+      <w:bookmarkStart w:id="37" w:name="_l2dbp78arg2w" w:colFirst="0" w:colLast="0"/>
+      <w:bookmarkStart w:id="38" w:name="_5f09pmj9qow8" w:colFirst="0" w:colLast="0"/>
+      <w:bookmarkStart w:id="39" w:name="_Toc28279213"/>
+      <w:bookmarkStart w:id="40" w:name="_Hlk28263348"/>
+      <w:bookmarkEnd w:id="37"/>
+      <w:bookmarkEnd w:id="38"/>
       <w:r>
-        <w:t>Figure 1: System Boundary &amp; Interconnect Block Diagram</w:t>
+        <w:t xml:space="preserve">Figure </w:t>
       </w:r>
+      <w:fldSimple w:instr=" SEQ Figure \* ARABIC ">
+        <w:r>
+          <w:t>1</w:t>
+        </w:r>
+      </w:fldSimple>
+      <w:r>
+        <w:t>: Boundary Diagram</w:t>
+      </w:r>
+      <w:bookmarkEnd w:id="39"/>
     </w:p>
     <w:bookmarkEnd w:id="40"/>
     <w:p>
-      <w:r>
-        <w:t>Also, if the product comprises of developing multiple systems (say, IOT Gateway and a BLE sensor to be developed for a project, are two different systems itself), each system shall be mentioned within the product block. Each of these systems shall have a separate detailed requirement sheet (in Product Requirements section of this document) and design documents etc.</w:t>
-      </w:r>
+      <w:r/>
     </w:p>
     <w:p>
-      <w:r>
-        <w:t>A diagram showing various systems of the product and the external entities and all the interfaces among them shall be included here&gt;</w:t>
-      </w:r>
+      <w:r/>
     </w:p>
     <w:p>
       <w:r>
@@ -9411,40 +9367,29 @@
     </w:p>
     <w:p>
       <w:r>
-        <w:t xml:space="preserve">The primary operational functions include: precision DC voltage setpoint adjustment (5.0V to 20.0V in 10mV increments), dynamic load step transient suppression (&lt; 120µs recovery), ultra-fast hardware constant-current clamping (&lt; 5µs reaction), dual-domain true efficiency metering at 10Hz, autonomous FAT32 CSV logging, and remote IEEE 488.2 SCPI command execution. or must let the user perform. Only a high level summary is needed here. Organize the functions to make them understandable to any reader of the PRD. </w:t>
+        <w:t>The Smart Programmable Voltage Supply Module performs high-efficiency AC-DC power conversion with digital voltage regulation, fast hardware current limiting, real-time power metering, and remote automation control. The major functional use cases are summarized in Table 3 below:</w:t>
+      </w:r>
+    </w:p>
+    <w:p>
+      <w:r/>
+    </w:p>
+    <w:p>
+      <w:r>
+        <w:t>The benchtop operator interacts with the power supply using front-panel dual rotary optical encoders and a 1.3" graphical OLED display. Automated test equipment (ATE) and host PCs communicate via USB Type-C using standard SCPI instrumentation commands. Power is delivered to the device under test (DUT) via heavy-duty 4mm binding posts, and operational telemetry is autonomously logged to an onboard MicroSD card.</w:t>
       </w:r>
     </w:p>
     <w:p>
       <w:r>
-        <w:t xml:space="preserve">A picture of the major groups of related requirements and how they relate, such as a </w:t>
-      </w:r>
-      <w:proofErr w:type="gramStart"/>
-      <w:r>
-        <w:t>top level</w:t>
-      </w:r>
-      <w:proofErr w:type="gramEnd"/>
-      <w:r>
-        <w:t xml:space="preserve"> interface diagram is effective.&gt;</w:t>
+        <w:t>The power supply module operates in four primary operating modes: Constant Voltage (CV) Mode for stable voltage regulation across varying loads; Constant Current (CC) Mode for ultra-fast hardware clamping during overload or short-circuit; Autonomous Dual-Domain Telemetry Mode for 10Hz power and efficiency logging; and Automated ATE Remote Control Mode for external script-driven testing.</w:t>
       </w:r>
     </w:p>
     <w:p>
       <w:r>
-        <w:t>The bench operator interacts through dual rotary optical encoders and a 1.3" graphical OLED display. Host ATE automated test systems interact over USB Type-C using SCPI instrumentation commands. The DUT receives regulated DC power via heavy-duty gold binding posts, while long-duration telemetry records stream continuously to an onboard MicroSD card. like Admin, End user, Cloud and other application with the product &gt;</w:t>
-      </w:r>
-    </w:p>
-    <w:p>
-      <w:r>
-        <w:t>The module operates in three distinct electrical modes: Constant Voltage (CV) Mode where voltage is tightly regulated across 0-3A loads; Constant Current (CC) Mode where hardware clamps current at setpoint upon overload; and Fault Tripped Mode (OVP/OTP/SCP) where power delivery is latched off until cleared. of the product.  For example, the device acts as Access Point, Mesh, Wi-Fi client mode of operation and corresponding major operation along with external entity &gt;</w:t>
-      </w:r>
-    </w:p>
-    <w:p>
-      <w:r>
-        <w:t>In CV mode, LM5176 seamlessly transitions between Buck mode (Vout &lt; 24V), Buck-Boost mode (Vout ~ 24V), and Boost mode with synchronous rectification. In CC mode, an analog comparator overrides the feedback loop in &lt; 5µs, protecting sensitive prototype DUT circuits without MCU firmware delay. of operation and interaction with External entities&gt;</w:t>
+        <w:t>In CV mode, the 4-switch synchronous Buck-Boost stage transitions smoothly between Buck, Buck-Boost, and Boost modes. In CC mode, an autonomous analog comparator overrides the feedback loop in less than 5 microseconds to protect the load, while the MCU logs the event.</w:t>
       </w:r>
     </w:p>
     <w:tbl>
       <w:tblPr>
-        <w:tblpPr w:leftFromText="180" w:rightFromText="180" w:vertAnchor="text" w:horzAnchor="page" w:tblpX="1980" w:tblpY="256"/>
         <w:tblOverlap w:val="never"/>
         <w:tblW w:w="9316" w:type="dxa"/>
         <w:tblLayout w:type="fixed"/>
@@ -9766,22 +9711,9 @@
         <w:pStyle w:val="Caption"/>
         <w:jc w:val="center"/>
       </w:pPr>
-      <w:bookmarkStart w:id="62" w:name="_Toc28331324"/>
       <w:r>
-        <w:t xml:space="preserve">Table </w:t>
+        <w:t>Table 3: Primary Use Case Summary</w:t>
       </w:r>
-      <w:fldSimple w:instr=" SEQ Table \* ARABIC ">
-        <w:r>
-          <w:rPr>
-            <w:noProof/>
-          </w:rPr>
-          <w:t>3</w:t>
-        </w:r>
-      </w:fldSimple>
-      <w:r>
-        <w:t>: Use Case</w:t>
-      </w:r>
-      <w:bookmarkEnd w:id="62"/>
     </w:p>
     <w:p>
       <w:pPr>
@@ -9798,7 +9730,7 @@
         </w:rPr>
       </w:pPr>
       <w:r>
-        <w:t>The benchtop operational tuning flow is illustrated in Figure 2 below:</w:t>
+        <w:t>The benchtop operational voltage tuning sequence is illustrated in Figure 2 below:</w:t>
       </w:r>
     </w:p>
     <w:tbl>
@@ -9896,7 +9828,7 @@
         </w:rPr>
       </w:pPr>
       <w:r>
-        <w:t>The automated ATE SCPI communication and telemetry flow is illustrated in Figure 3 below:</w:t>
+        <w:t>The automated ATE SCPI instrumentation and telemetry logging flow is illustrated in Figure 3 below:</w:t>
       </w:r>
     </w:p>
     <w:tbl>
@@ -18432,83 +18364,6 @@
         </w:drawing>
       </w:r>
     </w:p>
-    <w:tbl>
-      <w:tblPr>
-        <w:tblW w:type="dxa" w:w="9316"/>
-        <w:tblLayout w:type="fixed"/>
-        <w:tblLook w:firstColumn="1" w:firstRow="1" w:lastColumn="0" w:lastRow="0" w:noHBand="0" w:noVBand="1" w:val="04A0"/>
-        <w:tblBorders>
-          <w:top w:val="single" w:sz="6" w:space="0" w:color="A0AEC0"/>
-          <w:left w:val="single" w:sz="6" w:space="0" w:color="A0AEC0"/>
-          <w:bottom w:val="single" w:sz="6" w:space="0" w:color="A0AEC0"/>
-          <w:right w:val="single" w:sz="6" w:space="0" w:color="A0AEC0"/>
-          <w:insideH w:val="single" w:sz="6" w:space="0" w:color="A0AEC0"/>
-          <w:insideV w:val="single" w:sz="6" w:space="0" w:color="A0AEC0"/>
-        </w:tblBorders>
-      </w:tblPr>
-      <w:tblGrid>
-        <w:gridCol w:w="9316"/>
-      </w:tblGrid>
-      <w:tr>
-        <w:trPr>
-          <w:cantSplit/>
-          <w:tblHeader/>
-        </w:trPr>
-        <w:tc>
-          <w:tcPr>
-            <w:tcW w:type="dxa" w:w="9316"/>
-            <w:shd w:val="clear" w:color="auto" w:fill="F4F6F9"/>
-            <w:tcMar>
-              <w:top w:w="140" w:type="dxa"/>
-              <w:bottom w:w="140" w:type="dxa"/>
-              <w:left w:w="180" w:type="dxa"/>
-              <w:right w:w="180" w:type="dxa"/>
-            </w:tcMar>
-          </w:tcPr>
-          <w:p>
-            <w:pPr>
-              <w:spacing w:before="40" w:after="40" w:line="252" w:lineRule="auto"/>
-            </w:pPr>
-            <w:r>
-              <w:rPr>
-                <w:rFonts w:ascii="Consolas" w:hAnsi="Consolas"/>
-                <w:color w:val="141923"/>
-                <w:sz w:val="16"/>
-              </w:rPr>
-              <w:t>+--------------------------------------------------------------------------------------------------+</w:t>
-              <w:br/>
-              <w:t>|                     DUAL-CLOSED-LOOP REAL-TIME CONTROL TOPOLOGY                                  |</w:t>
-              <w:br/>
-              <w:t>+--------------------------------------------------------------------------------------------------+</w:t>
-              <w:br/>
-              <w:t xml:space="preserve">  [OUTER SUPERVISORY DIGITAL LOOP - STM32G474 MCU @ 10 Hz]                                         </w:t>
-              <w:br/>
-              <w:t xml:space="preserve">    • Step 1: Sample Isolated Mains Voltage (AMC1311) &amp; Current (Talema CT) -&gt; Compute True Pac   </w:t>
-              <w:br/>
-              <w:t xml:space="preserve">    • Step 2: Sample Secondary Regulated Rail via I2C (INA226 16-Bit)       -&gt; Compute True Pdc   </w:t>
-              <w:br/>
-              <w:t xml:space="preserve">    • Step 3: Math Engine calculates instantaneous efficiency (η = Pdc / Pac) with digital filter  </w:t>
-              <w:br/>
-              <w:t xml:space="preserve">    • Step 4: Monitor Board Thermal Profile via NTC -&gt; Execute thermal power foldback if T &gt; 85°C  </w:t>
-              <w:br/>
-              <w:t xml:space="preserve">    • Step 5: Service SCPI Commands over USB-CDC &amp; Flush Ring-Buffer CSV records to MicroSD card   </w:t>
-              <w:br/>
-              <w:t xml:space="preserve">                                                                                                   </w:t>
-              <w:br/>
-              <w:t xml:space="preserve">  [INNER ULTRA-FAST ANALOG HARDWARE LOOP - AUTONOMOUS CONTROLLER &amp; COMPARATORS]                    </w:t>
-              <w:br/>
-              <w:t xml:space="preserve">    • Voltage Regulation: LM5176 Type-II Compensation Network restores step transients in &lt; 120µs  </w:t>
-              <w:br/>
-              <w:t xml:space="preserve">    • Hardware CC Limit: Shunt -&gt; INA240A2 (50V/V) -&gt; TLV3501 pulls down COMP pin in &lt; 5.0µs      </w:t>
-              <w:br/>
-              <w:t xml:space="preserve">    • Fast OVP Crowbar: Secondary Comparator clamps COMP to GND in &lt; 2.0µs on output disconnect   </w:t>
-              <w:br/>
-              <w:t>+--------------------------------------------------------------------------------------------------+</w:t>
-            </w:r>
-          </w:p>
-        </w:tc>
-      </w:tr>
-    </w:tbl>
     <w:p>
       <w:pPr>
         <w:pStyle w:val="Caption"/>
@@ -18518,9 +18373,23 @@
           <w:sz w:val="22"/>
         </w:rPr>
       </w:pPr>
+      <w:bookmarkStart w:id="88" w:name="_Toc28279216"/>
+      <w:bookmarkStart w:id="89" w:name="_Toc15414754"/>
       <w:r>
-        <w:t>Figure 4: Dual-Closed-Loop Control &amp; Hardware Protection Flow Diagram</w:t>
+        <w:t xml:space="preserve">Figure </w:t>
       </w:r>
+      <w:fldSimple w:instr=" SEQ Figure \* ARABIC ">
+        <w:r>
+          <w:rPr>
+            <w:noProof/>
+          </w:rPr>
+          <w:t>4</w:t>
+        </w:r>
+      </w:fldSimple>
+      <w:r>
+        <w:t>: Flow Diagram</w:t>
+      </w:r>
+      <w:bookmarkEnd w:id="88"/>
     </w:p>
     <w:p>
       <w:pPr>
@@ -21452,7 +21321,24 @@
       </w:r>
     </w:p>
     <w:p>
-      <w:r/>
+      <w:r>
+        <w:t>&lt; Architecture Diagram with caption, shall be inserted here. No explanation of architecture is required. Below architecture diagram, there shall be a note “This is the proposed architecture and it might get changed during the design stage”</w:t>
+      </w:r>
+      <w:r>
+        <w:t xml:space="preserve"> and “</w:t>
+      </w:r>
+      <w:r>
+        <w:rPr>
+          <w:color w:val="FF0000"/>
+        </w:rPr>
+        <w:t>Ensure the license compliance for usage of open source tools</w:t>
+      </w:r>
+      <w:r>
+        <w:t xml:space="preserve">”. </w:t>
+      </w:r>
+      <w:r>
+        <w:t>&gt;</w:t>
+      </w:r>
     </w:p>
     <w:p>
       <w:pPr>
@@ -21558,7 +21444,27 @@
       </w:r>
     </w:p>
     <w:p>
-      <w:r/>
+      <w:r>
+        <w:t>&lt; Architecture Diagram with caption, shall be inserted here. No explanation of architecture is required. Below architecture diagram, there shall be a note “This is the proposed architecture and it might get changed during the design stage”</w:t>
+      </w:r>
+      <w:r>
+        <w:t xml:space="preserve"> and “</w:t>
+      </w:r>
+      <w:r>
+        <w:rPr>
+          <w:color w:val="FF0000"/>
+        </w:rPr>
+        <w:t>Ensure the license compliance for usage of open source tools</w:t>
+      </w:r>
+      <w:r>
+        <w:t>”</w:t>
+      </w:r>
+      <w:r>
+        <w:t>.</w:t>
+      </w:r>
+      <w:r>
+        <w:t>&gt;</w:t>
+      </w:r>
     </w:p>
     <w:p>
       <w:pPr>
@@ -21684,7 +21590,27 @@
       </w:r>
     </w:p>
     <w:p>
-      <w:r/>
+      <w:r>
+        <w:t>&lt; Architecture Diagram with caption, shall be inserted here. No explanation of architecture is required. Below architecture diagram, there shall be a note “This is the proposed architecture and it might get changed during the design stage”</w:t>
+      </w:r>
+      <w:r>
+        <w:t xml:space="preserve"> and “</w:t>
+      </w:r>
+      <w:r>
+        <w:rPr>
+          <w:color w:val="FF0000"/>
+        </w:rPr>
+        <w:t>Ensure the license compliance for usage of open source tools</w:t>
+      </w:r>
+      <w:r>
+        <w:t>”</w:t>
+      </w:r>
+      <w:r>
+        <w:t>.</w:t>
+      </w:r>
+      <w:r>
+        <w:t>&gt;</w:t>
+      </w:r>
     </w:p>
     <w:p>
       <w:bookmarkStart w:id="118" w:name="_Toc15414767"/>

</xml_diff>